<commit_message>
updated IPS and IPA semester work
</commit_message>
<xml_diff>
--- a/!!jasonpieterkwork/IPS/SEMESTER 1/CATATAN IPS BAB 1.docx
+++ b/!!jasonpieterkwork/IPS/SEMESTER 1/CATATAN IPS BAB 1.docx
@@ -3554,6 +3554,8 @@
         <w:ind w:left="426"/>
         <w:rPr>
           <w:rFonts w:ascii="Balsamiq Sans" w:hAnsi="Balsamiq Sans"/>
+          <w:b/>
+          <w:bCs/>
           <w:lang w:val="en-ID"/>
         </w:rPr>
       </w:pPr>
@@ -4281,6 +4283,245 @@
           <w:lang w:val="en-ID"/>
         </w:rPr>
         <w:t>.</w:t>
+      </w:r>
+    </w:p>
+    <w:p>
+      <w:pPr>
+        <w:rPr>
+          <w:rFonts w:ascii="Balsamiq Sans" w:hAnsi="Balsamiq Sans"/>
+          <w:b/>
+          <w:bCs/>
+          <w:color w:val="0070C0"/>
+          <w:sz w:val="32"/>
+          <w:szCs w:val="32"/>
+        </w:rPr>
+      </w:pPr>
+      <w:r>
+        <w:rPr>
+          <w:rFonts w:ascii="Balsamiq Sans" w:hAnsi="Balsamiq Sans"/>
+          <w:b/>
+          <w:bCs/>
+          <w:color w:val="0070C0"/>
+          <w:sz w:val="32"/>
+          <w:szCs w:val="32"/>
+        </w:rPr>
+        <w:t>E</w:t>
+      </w:r>
+      <w:r>
+        <w:rPr>
+          <w:rFonts w:ascii="Balsamiq Sans" w:hAnsi="Balsamiq Sans"/>
+          <w:b/>
+          <w:bCs/>
+          <w:color w:val="0070C0"/>
+          <w:sz w:val="32"/>
+          <w:szCs w:val="32"/>
+        </w:rPr>
+        <w:t>.</w:t>
+      </w:r>
+      <w:r>
+        <w:rPr>
+          <w:rFonts w:ascii="Balsamiq Sans" w:hAnsi="Balsamiq Sans"/>
+          <w:b/>
+          <w:bCs/>
+          <w:color w:val="0070C0"/>
+          <w:sz w:val="32"/>
+          <w:szCs w:val="32"/>
+        </w:rPr>
+        <w:t xml:space="preserve"> Catatan tambahan – (Kata – Istilah)</w:t>
+      </w:r>
+    </w:p>
+    <w:p>
+      <w:pPr>
+        <w:ind w:left="283"/>
+        <w:rPr>
+          <w:rFonts w:ascii="Balsamiq Sans" w:hAnsi="Balsamiq Sans"/>
+          <w:b/>
+          <w:bCs/>
+          <w:color w:val="C00000"/>
+          <w:sz w:val="28"/>
+          <w:szCs w:val="28"/>
+        </w:rPr>
+      </w:pPr>
+      <w:r>
+        <w:rPr>
+          <w:rFonts w:ascii="Balsamiq Sans" w:hAnsi="Balsamiq Sans"/>
+          <w:b/>
+          <w:bCs/>
+          <w:color w:val="C00000"/>
+          <w:sz w:val="28"/>
+          <w:szCs w:val="28"/>
+        </w:rPr>
+        <w:t xml:space="preserve">Stereotisme:  </w:t>
+      </w:r>
+    </w:p>
+    <w:p>
+      <w:pPr>
+        <w:ind w:left="425"/>
+        <w:rPr>
+          <w:rFonts w:ascii="Balsamiq Sans" w:hAnsi="Balsamiq Sans"/>
+        </w:rPr>
+      </w:pPr>
+      <w:r>
+        <w:rPr>
+          <w:rFonts w:ascii="Balsamiq Sans" w:hAnsi="Balsamiq Sans"/>
+        </w:rPr>
+        <w:t>Penilaian / anggapan / gambaran umum yang terlalu disederhanakan mengenai suatu kelompok orang berdasarkan ras, gender / suku bangsa tanpa melihat sifat asli individu tersebut.</w:t>
+      </w:r>
+    </w:p>
+    <w:p>
+      <w:pPr>
+        <w:ind w:left="283"/>
+        <w:rPr>
+          <w:rFonts w:ascii="Balsamiq Sans" w:hAnsi="Balsamiq Sans"/>
+          <w:b/>
+          <w:bCs/>
+          <w:color w:val="C00000"/>
+          <w:sz w:val="28"/>
+          <w:szCs w:val="28"/>
+        </w:rPr>
+      </w:pPr>
+      <w:r>
+        <w:rPr>
+          <w:rFonts w:ascii="Balsamiq Sans" w:hAnsi="Balsamiq Sans"/>
+          <w:b/>
+          <w:bCs/>
+          <w:color w:val="C00000"/>
+          <w:sz w:val="28"/>
+          <w:szCs w:val="28"/>
+        </w:rPr>
+        <w:t xml:space="preserve">Libertulisme:  </w:t>
+      </w:r>
+    </w:p>
+    <w:p>
+      <w:pPr>
+        <w:ind w:left="425"/>
+        <w:rPr>
+          <w:rFonts w:ascii="Balsamiq Sans" w:hAnsi="Balsamiq Sans"/>
+        </w:rPr>
+      </w:pPr>
+      <w:r>
+        <w:rPr>
+          <w:rFonts w:ascii="Balsamiq Sans" w:hAnsi="Balsamiq Sans"/>
+        </w:rPr>
+        <w:lastRenderedPageBreak/>
+        <w:t>Kebebasan individu, persamaan hukum, pembatasan kekuasaan negara dan ekonomi pasar bebas.</w:t>
+      </w:r>
+    </w:p>
+    <w:p>
+      <w:pPr>
+        <w:ind w:left="283"/>
+        <w:rPr>
+          <w:rFonts w:ascii="Balsamiq Sans" w:hAnsi="Balsamiq Sans"/>
+          <w:b/>
+          <w:bCs/>
+          <w:color w:val="C00000"/>
+          <w:sz w:val="28"/>
+          <w:szCs w:val="28"/>
+        </w:rPr>
+      </w:pPr>
+      <w:r>
+        <w:rPr>
+          <w:rFonts w:ascii="Balsamiq Sans" w:hAnsi="Balsamiq Sans"/>
+          <w:b/>
+          <w:bCs/>
+          <w:color w:val="C00000"/>
+          <w:sz w:val="28"/>
+          <w:szCs w:val="28"/>
+        </w:rPr>
+        <w:t xml:space="preserve">Scape goating:  </w:t>
+      </w:r>
+    </w:p>
+    <w:p>
+      <w:pPr>
+        <w:ind w:left="425"/>
+        <w:rPr>
+          <w:rFonts w:ascii="Balsamiq Sans" w:hAnsi="Balsamiq Sans"/>
+        </w:rPr>
+      </w:pPr>
+      <w:r>
+        <w:rPr>
+          <w:rFonts w:ascii="Balsamiq Sans" w:hAnsi="Balsamiq Sans"/>
+        </w:rPr>
+        <w:t>Tindakan menyalahkan / mengalihkan kesalahan kepada / orang lain yang tidak bersalah / fitnah.</w:t>
+      </w:r>
+    </w:p>
+    <w:p>
+      <w:pPr>
+        <w:ind w:left="283"/>
+        <w:rPr>
+          <w:rFonts w:ascii="Balsamiq Sans" w:hAnsi="Balsamiq Sans"/>
+          <w:b/>
+          <w:bCs/>
+          <w:color w:val="C00000"/>
+          <w:sz w:val="28"/>
+          <w:szCs w:val="28"/>
+        </w:rPr>
+      </w:pPr>
+      <w:r>
+        <w:rPr>
+          <w:rFonts w:ascii="Balsamiq Sans" w:hAnsi="Balsamiq Sans"/>
+          <w:b/>
+          <w:bCs/>
+          <w:color w:val="C00000"/>
+          <w:sz w:val="28"/>
+          <w:szCs w:val="28"/>
+        </w:rPr>
+        <w:t>Antropogenic:</w:t>
+      </w:r>
+    </w:p>
+    <w:p>
+      <w:pPr>
+        <w:ind w:left="425"/>
+        <w:rPr>
+          <w:rFonts w:ascii="Balsamiq Sans" w:hAnsi="Balsamiq Sans"/>
+        </w:rPr>
+      </w:pPr>
+      <w:r>
+        <w:rPr>
+          <w:rFonts w:ascii="Balsamiq Sans" w:hAnsi="Balsamiq Sans"/>
+        </w:rPr>
+        <w:t>Aktivitas manusia pada lingkungan sekitar.</w:t>
+      </w:r>
+    </w:p>
+    <w:p>
+      <w:pPr>
+        <w:ind w:left="283"/>
+        <w:rPr>
+          <w:rFonts w:ascii="Balsamiq Sans" w:hAnsi="Balsamiq Sans"/>
+          <w:b/>
+          <w:bCs/>
+          <w:color w:val="C00000"/>
+          <w:sz w:val="28"/>
+          <w:szCs w:val="28"/>
+        </w:rPr>
+      </w:pPr>
+      <w:r>
+        <w:rPr>
+          <w:rFonts w:ascii="Balsamiq Sans" w:hAnsi="Balsamiq Sans"/>
+          <w:b/>
+          <w:bCs/>
+          <w:color w:val="C00000"/>
+          <w:sz w:val="28"/>
+          <w:szCs w:val="28"/>
+        </w:rPr>
+        <w:t>Etnosentrisme:</w:t>
+      </w:r>
+    </w:p>
+    <w:p>
+      <w:pPr>
+        <w:ind w:left="425"/>
+        <w:rPr>
+          <w:rFonts w:ascii="Balsamiq Sans" w:hAnsi="Balsamiq Sans"/>
+          <w:sz w:val="20"/>
+          <w:szCs w:val="20"/>
+          <w:lang w:val="en-ID"/>
+        </w:rPr>
+      </w:pPr>
+      <w:r>
+        <w:rPr>
+          <w:rFonts w:ascii="Balsamiq Sans" w:hAnsi="Balsamiq Sans"/>
+        </w:rPr>
+        <w:t xml:space="preserve">Pandangan bahwa agama dan kebudayaan sendiri lebih baik daripada orang lain. </w:t>
       </w:r>
     </w:p>
     <w:sectPr>
@@ -5908,6 +6149,8 @@
     <w:rsid w:val="00045C83"/>
     <w:rsid w:val="000D3923"/>
     <w:rsid w:val="00140A88"/>
+    <w:rsid w:val="002D15AE"/>
+    <w:rsid w:val="004014EF"/>
     <w:rsid w:val="00495416"/>
     <w:rsid w:val="006966E0"/>
     <w:rsid w:val="006E50D5"/>

</xml_diff>